<commit_message>
Correct the reading of the disputed sentence in the lab analysis
The closing line of the laboratory analysis, that MBEE demonstrated inhibitory
activity at <50 ug/ml, was previously written up as a flat contradiction of
Table 1. That was too strong.

Read as a percentage rather than a concentration it is correct. Inhibition is
100 minus viability and the maximum anywhere in the run was 34.96 percent, so
inhibition never reached 50 percent. That reading fits the surrounding text
about the IC50 comparison, and the printed unit is likely a typo for a percent
sign.

It also reinforces the main conclusion instead of undermining it, since
inhibition never crossing 50 percent is exactly why the IC50 cannot be
determined from this series. The wording still needs fixing before it reaches
the manuscript, because taken literally it claims low dose activity that the
data does not show.

Credit to Rhian Margarette for spotting the alternative reading.
</commit_message>
<xml_diff>
--- a/results/VALIDATION_REPORT.docx
+++ b/results/VALIDATION_REPORT.docx
@@ -1857,7 +1857,7 @@
         <w:pStyle w:val="Heading2"/>
       </w:pPr>
       <w:r>
-        <w:t>One sentence in the laboratory report does not match its own table</w:t>
+        <w:t>One sentence in the laboratory report is ambiguous and should be reworded</w:t>
       </w:r>
     </w:p>
     <w:p>
@@ -1869,7 +1869,43 @@
           <w:b w:val="0"/>
           <w:sz w:val="22"/>
         </w:rPr>
-        <w:t>The analysis section states that the extract demonstrated inhibitory activity at below 50 micrograms per millilitre. The table on the previous page shows viability of 103.22 percent at 50, 107.32 at 25, and 120.30 at 12.5, all above the untreated control. The sentence looks like a leftover from a template. Worth querying so it does not get quoted into the manuscript.</w:t>
+        <w:t>The analysis section closes with the statement that the extract demonstrated inhibitory activity against A549 cells at less than 50 ug/ml. That sentence has two readings and they lead to opposite conclusions.</w:t>
+      </w:r>
+    </w:p>
+    <w:p>
+      <w:pPr>
+        <w:spacing w:after="160"/>
+      </w:pPr>
+      <w:r>
+        <w:rPr>
+          <w:b w:val="0"/>
+          <w:sz w:val="22"/>
+        </w:rPr>
+        <w:t>Read as a concentration, meaning inhibition occurred at doses below 50 micrograms per millilitre, it contradicts the table on the previous page, which shows viability of 103.22 percent at 50, 107.32 at 25, and 120.30 at 12.5, all above the untreated control.</w:t>
+      </w:r>
+    </w:p>
+    <w:p>
+      <w:pPr>
+        <w:spacing w:after="160"/>
+      </w:pPr>
+      <w:r>
+        <w:rPr>
+          <w:b w:val="0"/>
+          <w:sz w:val="22"/>
+        </w:rPr>
+        <w:t>Read as a percentage, meaning inhibition never exceeded 50 percent, it is correct. Inhibition is 100 minus viability, and the maximum reached anywhere in the run was 34.96 percent at the top dose. On that reading the printed unit is a typographical error for a percent sign.</w:t>
+      </w:r>
+    </w:p>
+    <w:p>
+      <w:pPr>
+        <w:spacing w:after="160"/>
+      </w:pPr>
+      <w:r>
+        <w:rPr>
+          <w:b w:val="0"/>
+          <w:sz w:val="22"/>
+        </w:rPr>
+        <w:t>The second reading is the more likely one and it fits the surrounding text, which is discussing the IC50 comparison. It also reinforces rather than softens the main conclusion, because inhibition never reaching 50 percent is precisely why the IC50 cannot be determined from this dose series. The wording still needs to be fixed before it enters the manuscript, since a reader who takes it literally will conclude the extract works at low dose, which the data does not support.</w:t>
       </w:r>
     </w:p>
     <w:p>
@@ -1913,7 +1949,7 @@
           <w:b w:val="0"/>
           <w:sz w:val="22"/>
         </w:rPr>
-        <w:t>Three things should change in the write up. The IC50 should be reported as greater than 400 micrograms per millilitre with the extrapolated figure shown separately and labelled. The claim of activity below 50 micrograms per millilitre should be removed. The absence of a vehicle control and a cell free interference control should be stated as limitations, since without them the above 100 percent readings at low dose cannot be explained.</w:t>
+        <w:t>Three things should change in the write up. The IC50 should be reported as greater than 400 micrograms per millilitre with the extrapolated figure shown separately and labelled. The sentence about activity at less than 50 ug/ml should be rewritten to say plainly that inhibition did not exceed 50 percent at any concentration tested. The absence of a vehicle control and a cell free interference control should be stated as limitations, since without them the above 100 percent readings at low dose cannot be explained.</w:t>
       </w:r>
     </w:p>
     <w:p>

</xml_diff>

<commit_message>
Restate the disputed lab sentence as unsupported rather than merely ambiguous
The previous commit leaned too far toward the charitable reading. As written
the sentence says <50 ug/ml, and ug/ml is used as a concentration everywhere
else in the document including every dose in the same table. On the plain
reading it is contradicted by Table 1, where viability at 50, 25 and 12.5
ug/mL is 103.22, 107.32 and 120.30 percent, giving negative inhibition.

Two corrections would each make it true. Flipping the inequality to >50 ug/ml
is one character and matches the data. Reading 50 as a percent is also true
since maximum inhibition was 34.96 percent, but requires replacing the whole
unit. That two different repairs both work is why the sentence needs to be
rewritten by the lab rather than interpreted by us.
</commit_message>
<xml_diff>
--- a/results/VALIDATION_REPORT.docx
+++ b/results/VALIDATION_REPORT.docx
@@ -1857,7 +1857,7 @@
         <w:pStyle w:val="Heading2"/>
       </w:pPr>
       <w:r>
-        <w:t>One sentence in the laboratory report is ambiguous and should be reworded</w:t>
+        <w:t>One sentence in the laboratory analysis is not supported by the table</w:t>
       </w:r>
     </w:p>
     <w:p>
@@ -1869,7 +1869,7 @@
           <w:b w:val="0"/>
           <w:sz w:val="22"/>
         </w:rPr>
-        <w:t>The analysis section closes with the statement that the extract demonstrated inhibitory activity against A549 cells at less than 50 ug/ml. That sentence has two readings and they lead to opposite conclusions.</w:t>
+        <w:t>The analysis section closes with the statement that the extract demonstrated inhibitory activity against A549 cells at less than 50 ug/ml. As written, that is contradicted by the report's own Table 1. Inhibitory activity means viability below the untreated control. At 50, 25 and 12.5 micrograms per millilitre the measured viability was 103.22, 107.32 and 120.30 percent, all above it. Converted to inhibition those doses give minus 3.22, minus 7.32 and minus 20.30 percent, which is stimulation rather than inhibition.</w:t>
       </w:r>
     </w:p>
     <w:p>
@@ -1881,7 +1881,7 @@
           <w:b w:val="0"/>
           <w:sz w:val="22"/>
         </w:rPr>
-        <w:t>Read as a concentration, meaning inhibition occurred at doses below 50 micrograms per millilitre, it contradicts the table on the previous page, which shows viability of 103.22 percent at 50, 107.32 at 25, and 120.30 at 12.5, all above the untreated control.</w:t>
+        <w:t>The unit printed is ug/ml, and that unit is used as a concentration everywhere else in the document, including for every dose in the same table. The plain reading is therefore a concentration, and on that reading the claim fails.</w:t>
       </w:r>
     </w:p>
     <w:p>
@@ -1893,7 +1893,7 @@
           <w:b w:val="0"/>
           <w:sz w:val="22"/>
         </w:rPr>
-        <w:t>Read as a percentage, meaning inhibition never exceeded 50 percent, it is correct. Inhibition is 100 minus viability, and the maximum reached anywhere in the run was 34.96 percent at the top dose. On that reading the printed unit is a typographical error for a percent sign.</w:t>
+        <w:t>Two corrections would each make the sentence true, which is worth noting because it shows the problem is wording rather than a disagreement about the data. Changing the inequality to greater than 50 ug/ml is a single character and matches the result, since inhibition appears only at 100, 200 and 400 micrograms per millilitre. Reading the figure as a percentage instead, meaning inhibition never exceeded 50 percent, is also true, because the maximum reached anywhere was 34.96 percent, but that requires replacing the entire unit rather than one symbol.</w:t>
       </w:r>
     </w:p>
     <w:p>
@@ -1905,7 +1905,7 @@
           <w:b w:val="0"/>
           <w:sz w:val="22"/>
         </w:rPr>
-        <w:t>The second reading is the more likely one and it fits the surrounding text, which is discussing the IC50 comparison. It also reinforces rather than softens the main conclusion, because inhibition never reaching 50 percent is precisely why the IC50 cannot be determined from this dose series. The wording still needs to be fixed before it enters the manuscript, since a reader who takes it literally will conclude the extract works at low dose, which the data does not support.</w:t>
+        <w:t>That two different corrections both repair the sentence is the reason it cannot be left as an interpretation. The laboratory should state which was meant. Whichever it is, the underlying result is the same. Inhibition did not exceed 50 percent at any concentration tested, and no inhibition at all was observed below 100 micrograms per millilitre.</w:t>
       </w:r>
     </w:p>
     <w:p>

</xml_diff>